<commit_message>
added interfaces on sender
</commit_message>
<xml_diff>
--- a/doc/Sniffable_Documentazione_IT.docx
+++ b/doc/Sniffable_Documentazione_IT.docx
@@ -4337,9 +4337,9 @@
         </w:tblCellMar>
       </w:tblPr>
       <w:tblGrid>
-        <w:gridCol w:w="2198"/>
+        <w:gridCol w:w="2197"/>
         <w:gridCol w:w="4560"/>
-        <w:gridCol w:w="2602"/>
+        <w:gridCol w:w="2603"/>
       </w:tblGrid>
       <w:tr>
         <w:trPr>
@@ -4347,7 +4347,7 @@
         </w:trPr>
         <w:tc>
           <w:tcPr>
-            <w:tcW w:w="2198" w:type="dxa"/>
+            <w:tcW w:w="2197" w:type="dxa"/>
             <w:tcBorders>
               <w:top w:val="single" w:sz="2" w:space="0" w:color="1E3A5F"/>
               <w:start w:val="single" w:sz="2" w:space="0" w:color="1E3A5F"/>
@@ -4409,7 +4409,7 @@
         </w:tc>
         <w:tc>
           <w:tcPr>
-            <w:tcW w:w="2602" w:type="dxa"/>
+            <w:tcW w:w="2603" w:type="dxa"/>
             <w:tcBorders>
               <w:top w:val="single" w:sz="2" w:space="0" w:color="1E3A5F"/>
               <w:start w:val="single" w:sz="2" w:space="0" w:color="1E3A5F"/>
@@ -4443,7 +4443,7 @@
         <w:trPr/>
         <w:tc>
           <w:tcPr>
-            <w:tcW w:w="2198" w:type="dxa"/>
+            <w:tcW w:w="2197" w:type="dxa"/>
             <w:tcBorders>
               <w:top w:val="single" w:sz="2" w:space="0" w:color="C8DDE8"/>
               <w:start w:val="single" w:sz="2" w:space="0" w:color="C8DDE8"/>
@@ -4505,7 +4505,7 @@
         </w:tc>
         <w:tc>
           <w:tcPr>
-            <w:tcW w:w="2602" w:type="dxa"/>
+            <w:tcW w:w="2603" w:type="dxa"/>
             <w:tcBorders>
               <w:top w:val="single" w:sz="2" w:space="0" w:color="C8DDE8"/>
               <w:start w:val="single" w:sz="2" w:space="0" w:color="C8DDE8"/>
@@ -4539,7 +4539,7 @@
         <w:trPr/>
         <w:tc>
           <w:tcPr>
-            <w:tcW w:w="2198" w:type="dxa"/>
+            <w:tcW w:w="2197" w:type="dxa"/>
             <w:tcBorders>
               <w:top w:val="single" w:sz="2" w:space="0" w:color="C8DDE8"/>
               <w:start w:val="single" w:sz="2" w:space="0" w:color="C8DDE8"/>
@@ -4601,7 +4601,7 @@
         </w:tc>
         <w:tc>
           <w:tcPr>
-            <w:tcW w:w="2602" w:type="dxa"/>
+            <w:tcW w:w="2603" w:type="dxa"/>
             <w:tcBorders>
               <w:top w:val="single" w:sz="2" w:space="0" w:color="C8DDE8"/>
               <w:start w:val="single" w:sz="2" w:space="0" w:color="C8DDE8"/>
@@ -4635,7 +4635,7 @@
         <w:trPr/>
         <w:tc>
           <w:tcPr>
-            <w:tcW w:w="2198" w:type="dxa"/>
+            <w:tcW w:w="2197" w:type="dxa"/>
             <w:tcBorders>
               <w:top w:val="single" w:sz="2" w:space="0" w:color="C8DDE8"/>
               <w:start w:val="single" w:sz="2" w:space="0" w:color="C8DDE8"/>
@@ -4697,7 +4697,7 @@
         </w:tc>
         <w:tc>
           <w:tcPr>
-            <w:tcW w:w="2602" w:type="dxa"/>
+            <w:tcW w:w="2603" w:type="dxa"/>
             <w:tcBorders>
               <w:top w:val="single" w:sz="2" w:space="0" w:color="C8DDE8"/>
               <w:start w:val="single" w:sz="2" w:space="0" w:color="C8DDE8"/>
@@ -4731,7 +4731,7 @@
         <w:trPr/>
         <w:tc>
           <w:tcPr>
-            <w:tcW w:w="2198" w:type="dxa"/>
+            <w:tcW w:w="2197" w:type="dxa"/>
             <w:tcBorders>
               <w:top w:val="single" w:sz="2" w:space="0" w:color="C8DDE8"/>
               <w:start w:val="single" w:sz="2" w:space="0" w:color="C8DDE8"/>
@@ -4793,7 +4793,7 @@
         </w:tc>
         <w:tc>
           <w:tcPr>
-            <w:tcW w:w="2602" w:type="dxa"/>
+            <w:tcW w:w="2603" w:type="dxa"/>
             <w:tcBorders>
               <w:top w:val="single" w:sz="2" w:space="0" w:color="C8DDE8"/>
               <w:start w:val="single" w:sz="2" w:space="0" w:color="C8DDE8"/>
@@ -5432,8 +5432,8 @@
       </w:tblPr>
       <w:tblGrid>
         <w:gridCol w:w="1400"/>
-        <w:gridCol w:w="3998"/>
-        <w:gridCol w:w="1402"/>
+        <w:gridCol w:w="3997"/>
+        <w:gridCol w:w="1403"/>
         <w:gridCol w:w="2560"/>
       </w:tblGrid>
       <w:tr>
@@ -5473,7 +5473,7 @@
         </w:tc>
         <w:tc>
           <w:tcPr>
-            <w:tcW w:w="3998" w:type="dxa"/>
+            <w:tcW w:w="3997" w:type="dxa"/>
             <w:tcBorders>
               <w:top w:val="single" w:sz="2" w:space="0" w:color="1E3A5F"/>
               <w:start w:val="single" w:sz="2" w:space="0" w:color="1E3A5F"/>
@@ -5504,7 +5504,7 @@
         </w:tc>
         <w:tc>
           <w:tcPr>
-            <w:tcW w:w="1402" w:type="dxa"/>
+            <w:tcW w:w="1403" w:type="dxa"/>
             <w:tcBorders>
               <w:top w:val="single" w:sz="2" w:space="0" w:color="1E3A5F"/>
               <w:start w:val="single" w:sz="2" w:space="0" w:color="1E3A5F"/>
@@ -5600,7 +5600,7 @@
         </w:tc>
         <w:tc>
           <w:tcPr>
-            <w:tcW w:w="3998" w:type="dxa"/>
+            <w:tcW w:w="3997" w:type="dxa"/>
             <w:tcBorders>
               <w:top w:val="single" w:sz="2" w:space="0" w:color="C8DDE8"/>
               <w:start w:val="single" w:sz="2" w:space="0" w:color="C8DDE8"/>
@@ -5631,7 +5631,7 @@
         </w:tc>
         <w:tc>
           <w:tcPr>
-            <w:tcW w:w="1402" w:type="dxa"/>
+            <w:tcW w:w="1403" w:type="dxa"/>
             <w:tcBorders>
               <w:top w:val="single" w:sz="2" w:space="0" w:color="C8DDE8"/>
               <w:start w:val="single" w:sz="2" w:space="0" w:color="C8DDE8"/>
@@ -5727,7 +5727,7 @@
         </w:tc>
         <w:tc>
           <w:tcPr>
-            <w:tcW w:w="3998" w:type="dxa"/>
+            <w:tcW w:w="3997" w:type="dxa"/>
             <w:tcBorders>
               <w:top w:val="single" w:sz="2" w:space="0" w:color="C8DDE8"/>
               <w:start w:val="single" w:sz="2" w:space="0" w:color="C8DDE8"/>
@@ -5758,7 +5758,7 @@
         </w:tc>
         <w:tc>
           <w:tcPr>
-            <w:tcW w:w="1402" w:type="dxa"/>
+            <w:tcW w:w="1403" w:type="dxa"/>
             <w:tcBorders>
               <w:top w:val="single" w:sz="2" w:space="0" w:color="C8DDE8"/>
               <w:start w:val="single" w:sz="2" w:space="0" w:color="C8DDE8"/>
@@ -5854,7 +5854,7 @@
         </w:tc>
         <w:tc>
           <w:tcPr>
-            <w:tcW w:w="3998" w:type="dxa"/>
+            <w:tcW w:w="3997" w:type="dxa"/>
             <w:tcBorders>
               <w:top w:val="single" w:sz="2" w:space="0" w:color="C8DDE8"/>
               <w:start w:val="single" w:sz="2" w:space="0" w:color="C8DDE8"/>
@@ -5885,7 +5885,7 @@
         </w:tc>
         <w:tc>
           <w:tcPr>
-            <w:tcW w:w="1402" w:type="dxa"/>
+            <w:tcW w:w="1403" w:type="dxa"/>
             <w:tcBorders>
               <w:top w:val="single" w:sz="2" w:space="0" w:color="C8DDE8"/>
               <w:start w:val="single" w:sz="2" w:space="0" w:color="C8DDE8"/>
@@ -5981,7 +5981,7 @@
         </w:tc>
         <w:tc>
           <w:tcPr>
-            <w:tcW w:w="3998" w:type="dxa"/>
+            <w:tcW w:w="3997" w:type="dxa"/>
             <w:tcBorders>
               <w:top w:val="single" w:sz="2" w:space="0" w:color="C8DDE8"/>
               <w:start w:val="single" w:sz="2" w:space="0" w:color="C8DDE8"/>
@@ -6012,7 +6012,7 @@
         </w:tc>
         <w:tc>
           <w:tcPr>
-            <w:tcW w:w="1402" w:type="dxa"/>
+            <w:tcW w:w="1403" w:type="dxa"/>
             <w:tcBorders>
               <w:top w:val="single" w:sz="2" w:space="0" w:color="C8DDE8"/>
               <w:start w:val="single" w:sz="2" w:space="0" w:color="C8DDE8"/>
@@ -6108,7 +6108,7 @@
         </w:tc>
         <w:tc>
           <w:tcPr>
-            <w:tcW w:w="3998" w:type="dxa"/>
+            <w:tcW w:w="3997" w:type="dxa"/>
             <w:tcBorders>
               <w:top w:val="single" w:sz="2" w:space="0" w:color="C8DDE8"/>
               <w:start w:val="single" w:sz="2" w:space="0" w:color="C8DDE8"/>
@@ -6139,7 +6139,7 @@
         </w:tc>
         <w:tc>
           <w:tcPr>
-            <w:tcW w:w="1402" w:type="dxa"/>
+            <w:tcW w:w="1403" w:type="dxa"/>
             <w:tcBorders>
               <w:top w:val="single" w:sz="2" w:space="0" w:color="C8DDE8"/>
               <w:start w:val="single" w:sz="2" w:space="0" w:color="C8DDE8"/>
@@ -6235,7 +6235,7 @@
         </w:tc>
         <w:tc>
           <w:tcPr>
-            <w:tcW w:w="3998" w:type="dxa"/>
+            <w:tcW w:w="3997" w:type="dxa"/>
             <w:tcBorders>
               <w:top w:val="single" w:sz="2" w:space="0" w:color="C8DDE8"/>
               <w:start w:val="single" w:sz="2" w:space="0" w:color="C8DDE8"/>
@@ -6266,7 +6266,7 @@
         </w:tc>
         <w:tc>
           <w:tcPr>
-            <w:tcW w:w="1402" w:type="dxa"/>
+            <w:tcW w:w="1403" w:type="dxa"/>
             <w:tcBorders>
               <w:top w:val="single" w:sz="2" w:space="0" w:color="C8DDE8"/>
               <w:start w:val="single" w:sz="2" w:space="0" w:color="C8DDE8"/>
@@ -8999,8 +8999,8 @@
         </w:tblCellMar>
       </w:tblPr>
       <w:tblGrid>
-        <w:gridCol w:w="3598"/>
-        <w:gridCol w:w="2880"/>
+        <w:gridCol w:w="3597"/>
+        <w:gridCol w:w="2881"/>
         <w:gridCol w:w="2882"/>
       </w:tblGrid>
       <w:tr>
@@ -9009,7 +9009,7 @@
         </w:trPr>
         <w:tc>
           <w:tcPr>
-            <w:tcW w:w="3598" w:type="dxa"/>
+            <w:tcW w:w="3597" w:type="dxa"/>
             <w:tcBorders>
               <w:top w:val="single" w:sz="2" w:space="0" w:color="1E3A5F"/>
               <w:start w:val="single" w:sz="2" w:space="0" w:color="1E3A5F"/>
@@ -9040,7 +9040,7 @@
         </w:tc>
         <w:tc>
           <w:tcPr>
-            <w:tcW w:w="2880" w:type="dxa"/>
+            <w:tcW w:w="2881" w:type="dxa"/>
             <w:tcBorders>
               <w:top w:val="single" w:sz="2" w:space="0" w:color="1E3A5F"/>
               <w:start w:val="single" w:sz="2" w:space="0" w:color="1E3A5F"/>
@@ -9105,7 +9105,7 @@
         <w:trPr/>
         <w:tc>
           <w:tcPr>
-            <w:tcW w:w="3598" w:type="dxa"/>
+            <w:tcW w:w="3597" w:type="dxa"/>
             <w:tcBorders>
               <w:top w:val="single" w:sz="2" w:space="0" w:color="C8DDE8"/>
               <w:start w:val="single" w:sz="2" w:space="0" w:color="C8DDE8"/>
@@ -9136,7 +9136,7 @@
         </w:tc>
         <w:tc>
           <w:tcPr>
-            <w:tcW w:w="2880" w:type="dxa"/>
+            <w:tcW w:w="2881" w:type="dxa"/>
             <w:tcBorders>
               <w:top w:val="single" w:sz="2" w:space="0" w:color="C8DDE8"/>
               <w:start w:val="single" w:sz="2" w:space="0" w:color="C8DDE8"/>
@@ -9201,7 +9201,7 @@
         <w:trPr/>
         <w:tc>
           <w:tcPr>
-            <w:tcW w:w="3598" w:type="dxa"/>
+            <w:tcW w:w="3597" w:type="dxa"/>
             <w:tcBorders>
               <w:top w:val="single" w:sz="2" w:space="0" w:color="C8DDE8"/>
               <w:start w:val="single" w:sz="2" w:space="0" w:color="C8DDE8"/>
@@ -9232,7 +9232,7 @@
         </w:tc>
         <w:tc>
           <w:tcPr>
-            <w:tcW w:w="2880" w:type="dxa"/>
+            <w:tcW w:w="2881" w:type="dxa"/>
             <w:tcBorders>
               <w:top w:val="single" w:sz="2" w:space="0" w:color="C8DDE8"/>
               <w:start w:val="single" w:sz="2" w:space="0" w:color="C8DDE8"/>
@@ -9297,7 +9297,7 @@
         <w:trPr/>
         <w:tc>
           <w:tcPr>
-            <w:tcW w:w="3598" w:type="dxa"/>
+            <w:tcW w:w="3597" w:type="dxa"/>
             <w:tcBorders>
               <w:top w:val="single" w:sz="2" w:space="0" w:color="C8DDE8"/>
               <w:start w:val="single" w:sz="2" w:space="0" w:color="C8DDE8"/>
@@ -9328,7 +9328,7 @@
         </w:tc>
         <w:tc>
           <w:tcPr>
-            <w:tcW w:w="2880" w:type="dxa"/>
+            <w:tcW w:w="2881" w:type="dxa"/>
             <w:tcBorders>
               <w:top w:val="single" w:sz="2" w:space="0" w:color="C8DDE8"/>
               <w:start w:val="single" w:sz="2" w:space="0" w:color="C8DDE8"/>
@@ -9393,7 +9393,7 @@
         <w:trPr/>
         <w:tc>
           <w:tcPr>
-            <w:tcW w:w="3598" w:type="dxa"/>
+            <w:tcW w:w="3597" w:type="dxa"/>
             <w:tcBorders>
               <w:top w:val="single" w:sz="2" w:space="0" w:color="C8DDE8"/>
               <w:start w:val="single" w:sz="2" w:space="0" w:color="C8DDE8"/>
@@ -9424,7 +9424,7 @@
         </w:tc>
         <w:tc>
           <w:tcPr>
-            <w:tcW w:w="2880" w:type="dxa"/>
+            <w:tcW w:w="2881" w:type="dxa"/>
             <w:tcBorders>
               <w:top w:val="single" w:sz="2" w:space="0" w:color="C8DDE8"/>
               <w:start w:val="single" w:sz="2" w:space="0" w:color="C8DDE8"/>
@@ -9490,19 +9490,6 @@
       <w:pPr>
         <w:pStyle w:val="Normal"/>
         <w:spacing w:before="240" w:after="0"/>
-        <w:rPr/>
-      </w:pPr>
-      <w:r>
-        <w:rPr/>
-      </w:r>
-    </w:p>
-    <w:p>
-      <w:pPr>
-        <w:pStyle w:val="Heading2"/>
-        <w:spacing w:before="320" w:after="120"/>
-        <w:rPr/>
-      </w:pPr>
-      <w:r>
         <w:rPr>
           <w:rFonts w:eastAsia="Arial" w:cs="Arial"/>
           <w:b/>
@@ -9511,1073 +9498,6 @@
           <w:sz w:val="28"/>
           <w:szCs w:val="28"/>
         </w:rPr>
-        <w:t>Range di porte personalizzabile</w:t>
-      </w:r>
-    </w:p>
-    <w:tbl>
-      <w:tblPr>
-        <w:tblW w:w="9360" w:type="dxa"/>
-        <w:jc w:val="start"/>
-        <w:tblInd w:w="0" w:type="dxa"/>
-        <w:tblLayout w:type="fixed"/>
-        <w:tblCellMar>
-          <w:top w:w="80" w:type="dxa"/>
-          <w:start w:w="140" w:type="dxa"/>
-          <w:bottom w:w="80" w:type="dxa"/>
-          <w:end w:w="100" w:type="dxa"/>
-        </w:tblCellMar>
-      </w:tblPr>
-      <w:tblGrid>
-        <w:gridCol w:w="2398"/>
-        <w:gridCol w:w="3160"/>
-        <w:gridCol w:w="3802"/>
-      </w:tblGrid>
-      <w:tr>
-        <w:trPr>
-          <w:tblHeader w:val="true"/>
-        </w:trPr>
-        <w:tc>
-          <w:tcPr>
-            <w:tcW w:w="2398" w:type="dxa"/>
-            <w:tcBorders>
-              <w:top w:val="single" w:sz="2" w:space="0" w:color="1E3A5F"/>
-              <w:start w:val="single" w:sz="2" w:space="0" w:color="1E3A5F"/>
-              <w:bottom w:val="single" w:sz="2" w:space="0" w:color="1E3A5F"/>
-              <w:end w:val="single" w:sz="2" w:space="0" w:color="1E3A5F"/>
-            </w:tcBorders>
-            <w:shd w:fill="1E3A5F" w:val="clear"/>
-            <w:vAlign w:val="center"/>
-          </w:tcPr>
-          <w:p>
-            <w:pPr>
-              <w:pStyle w:val="Normal"/>
-              <w:jc w:val="center"/>
-              <w:rPr/>
-            </w:pPr>
-            <w:r>
-              <w:rPr>
-                <w:rFonts w:eastAsia="Arial" w:cs="Arial"/>
-                <w:b/>
-                <w:bCs/>
-                <w:color w:val="FFFFFF"/>
-                <w:sz w:val="20"/>
-                <w:szCs w:val="20"/>
-              </w:rPr>
-              <w:t>Modalità</w:t>
-            </w:r>
-          </w:p>
-        </w:tc>
-        <w:tc>
-          <w:tcPr>
-            <w:tcW w:w="3160" w:type="dxa"/>
-            <w:tcBorders>
-              <w:top w:val="single" w:sz="2" w:space="0" w:color="1E3A5F"/>
-              <w:start w:val="single" w:sz="2" w:space="0" w:color="1E3A5F"/>
-              <w:bottom w:val="single" w:sz="2" w:space="0" w:color="1E3A5F"/>
-              <w:end w:val="single" w:sz="2" w:space="0" w:color="1E3A5F"/>
-            </w:tcBorders>
-            <w:shd w:fill="1E3A5F" w:val="clear"/>
-            <w:vAlign w:val="center"/>
-          </w:tcPr>
-          <w:p>
-            <w:pPr>
-              <w:pStyle w:val="Normal"/>
-              <w:jc w:val="center"/>
-              <w:rPr/>
-            </w:pPr>
-            <w:r>
-              <w:rPr>
-                <w:rFonts w:eastAsia="Arial" w:cs="Arial"/>
-                <w:b/>
-                <w:bCs/>
-                <w:color w:val="FFFFFF"/>
-                <w:sz w:val="20"/>
-                <w:szCs w:val="20"/>
-              </w:rPr>
-              <w:t>Sintassi</w:t>
-            </w:r>
-          </w:p>
-        </w:tc>
-        <w:tc>
-          <w:tcPr>
-            <w:tcW w:w="3802" w:type="dxa"/>
-            <w:tcBorders>
-              <w:top w:val="single" w:sz="2" w:space="0" w:color="1E3A5F"/>
-              <w:start w:val="single" w:sz="2" w:space="0" w:color="1E3A5F"/>
-              <w:bottom w:val="single" w:sz="2" w:space="0" w:color="1E3A5F"/>
-              <w:end w:val="single" w:sz="2" w:space="0" w:color="1E3A5F"/>
-            </w:tcBorders>
-            <w:shd w:fill="1E3A5F" w:val="clear"/>
-            <w:vAlign w:val="center"/>
-          </w:tcPr>
-          <w:p>
-            <w:pPr>
-              <w:pStyle w:val="Normal"/>
-              <w:jc w:val="center"/>
-              <w:rPr/>
-            </w:pPr>
-            <w:r>
-              <w:rPr>
-                <w:rFonts w:eastAsia="Arial" w:cs="Arial"/>
-                <w:b/>
-                <w:bCs/>
-                <w:color w:val="FFFFFF"/>
-                <w:sz w:val="20"/>
-                <w:szCs w:val="20"/>
-              </w:rPr>
-              <w:t>Esempio</w:t>
-            </w:r>
-          </w:p>
-        </w:tc>
-      </w:tr>
-      <w:tr>
-        <w:trPr/>
-        <w:tc>
-          <w:tcPr>
-            <w:tcW w:w="2398" w:type="dxa"/>
-            <w:tcBorders>
-              <w:top w:val="single" w:sz="2" w:space="0" w:color="C8DDE8"/>
-              <w:start w:val="single" w:sz="2" w:space="0" w:color="C8DDE8"/>
-              <w:bottom w:val="single" w:sz="2" w:space="0" w:color="C8DDE8"/>
-              <w:end w:val="single" w:sz="2" w:space="0" w:color="C8DDE8"/>
-            </w:tcBorders>
-            <w:shd w:fill="FFFFFF" w:val="clear"/>
-            <w:tcMar>
-              <w:top w:w="70" w:type="dxa"/>
-              <w:bottom w:w="70" w:type="dxa"/>
-            </w:tcMar>
-          </w:tcPr>
-          <w:p>
-            <w:pPr>
-              <w:pStyle w:val="Normal"/>
-              <w:rPr/>
-            </w:pPr>
-            <w:r>
-              <w:rPr>
-                <w:rFonts w:eastAsia="Arial" w:cs="Arial"/>
-                <w:color w:val="1A1A2E"/>
-                <w:sz w:val="20"/>
-                <w:szCs w:val="20"/>
-              </w:rPr>
-              <w:t>Porta singola</w:t>
-            </w:r>
-          </w:p>
-        </w:tc>
-        <w:tc>
-          <w:tcPr>
-            <w:tcW w:w="3160" w:type="dxa"/>
-            <w:tcBorders>
-              <w:top w:val="single" w:sz="2" w:space="0" w:color="C8DDE8"/>
-              <w:start w:val="single" w:sz="2" w:space="0" w:color="C8DDE8"/>
-              <w:bottom w:val="single" w:sz="2" w:space="0" w:color="C8DDE8"/>
-              <w:end w:val="single" w:sz="2" w:space="0" w:color="C8DDE8"/>
-            </w:tcBorders>
-            <w:shd w:fill="FFFFFF" w:val="clear"/>
-            <w:tcMar>
-              <w:top w:w="70" w:type="dxa"/>
-              <w:bottom w:w="70" w:type="dxa"/>
-            </w:tcMar>
-          </w:tcPr>
-          <w:p>
-            <w:pPr>
-              <w:pStyle w:val="Normal"/>
-              <w:rPr/>
-            </w:pPr>
-            <w:r>
-              <w:rPr>
-                <w:rFonts w:eastAsia="Arial" w:cs="Arial"/>
-                <w:color w:val="1A1A2E"/>
-                <w:sz w:val="20"/>
-                <w:szCs w:val="20"/>
-              </w:rPr>
-              <w:t>N</w:t>
-            </w:r>
-          </w:p>
-        </w:tc>
-        <w:tc>
-          <w:tcPr>
-            <w:tcW w:w="3802" w:type="dxa"/>
-            <w:tcBorders>
-              <w:top w:val="single" w:sz="2" w:space="0" w:color="C8DDE8"/>
-              <w:start w:val="single" w:sz="2" w:space="0" w:color="C8DDE8"/>
-              <w:bottom w:val="single" w:sz="2" w:space="0" w:color="C8DDE8"/>
-              <w:end w:val="single" w:sz="2" w:space="0" w:color="C8DDE8"/>
-            </w:tcBorders>
-            <w:shd w:fill="FFFFFF" w:val="clear"/>
-            <w:tcMar>
-              <w:top w:w="70" w:type="dxa"/>
-              <w:bottom w:w="70" w:type="dxa"/>
-            </w:tcMar>
-          </w:tcPr>
-          <w:p>
-            <w:pPr>
-              <w:pStyle w:val="Normal"/>
-              <w:rPr/>
-            </w:pPr>
-            <w:r>
-              <w:rPr>
-                <w:rFonts w:eastAsia="Arial" w:cs="Arial"/>
-                <w:color w:val="1A1A2E"/>
-                <w:sz w:val="20"/>
-                <w:szCs w:val="20"/>
-              </w:rPr>
-              <w:t>80</w:t>
-            </w:r>
-          </w:p>
-        </w:tc>
-      </w:tr>
-      <w:tr>
-        <w:trPr/>
-        <w:tc>
-          <w:tcPr>
-            <w:tcW w:w="2398" w:type="dxa"/>
-            <w:tcBorders>
-              <w:top w:val="single" w:sz="2" w:space="0" w:color="C8DDE8"/>
-              <w:start w:val="single" w:sz="2" w:space="0" w:color="C8DDE8"/>
-              <w:bottom w:val="single" w:sz="2" w:space="0" w:color="C8DDE8"/>
-              <w:end w:val="single" w:sz="2" w:space="0" w:color="C8DDE8"/>
-            </w:tcBorders>
-            <w:shd w:fill="E8F4F8" w:val="clear"/>
-            <w:tcMar>
-              <w:top w:w="70" w:type="dxa"/>
-              <w:bottom w:w="70" w:type="dxa"/>
-            </w:tcMar>
-          </w:tcPr>
-          <w:p>
-            <w:pPr>
-              <w:pStyle w:val="Normal"/>
-              <w:rPr/>
-            </w:pPr>
-            <w:r>
-              <w:rPr>
-                <w:rFonts w:eastAsia="Arial" w:cs="Arial"/>
-                <w:color w:val="1A1A2E"/>
-                <w:sz w:val="20"/>
-                <w:szCs w:val="20"/>
-              </w:rPr>
-              <w:t>Range continuo</w:t>
-            </w:r>
-          </w:p>
-        </w:tc>
-        <w:tc>
-          <w:tcPr>
-            <w:tcW w:w="3160" w:type="dxa"/>
-            <w:tcBorders>
-              <w:top w:val="single" w:sz="2" w:space="0" w:color="C8DDE8"/>
-              <w:start w:val="single" w:sz="2" w:space="0" w:color="C8DDE8"/>
-              <w:bottom w:val="single" w:sz="2" w:space="0" w:color="C8DDE8"/>
-              <w:end w:val="single" w:sz="2" w:space="0" w:color="C8DDE8"/>
-            </w:tcBorders>
-            <w:shd w:fill="E8F4F8" w:val="clear"/>
-            <w:tcMar>
-              <w:top w:w="70" w:type="dxa"/>
-              <w:bottom w:w="70" w:type="dxa"/>
-            </w:tcMar>
-          </w:tcPr>
-          <w:p>
-            <w:pPr>
-              <w:pStyle w:val="Normal"/>
-              <w:rPr/>
-            </w:pPr>
-            <w:r>
-              <w:rPr>
-                <w:rFonts w:eastAsia="Arial" w:cs="Arial"/>
-                <w:color w:val="1A1A2E"/>
-                <w:sz w:val="20"/>
-                <w:szCs w:val="20"/>
-              </w:rPr>
-              <w:t>N-M</w:t>
-            </w:r>
-          </w:p>
-        </w:tc>
-        <w:tc>
-          <w:tcPr>
-            <w:tcW w:w="3802" w:type="dxa"/>
-            <w:tcBorders>
-              <w:top w:val="single" w:sz="2" w:space="0" w:color="C8DDE8"/>
-              <w:start w:val="single" w:sz="2" w:space="0" w:color="C8DDE8"/>
-              <w:bottom w:val="single" w:sz="2" w:space="0" w:color="C8DDE8"/>
-              <w:end w:val="single" w:sz="2" w:space="0" w:color="C8DDE8"/>
-            </w:tcBorders>
-            <w:shd w:fill="E8F4F8" w:val="clear"/>
-            <w:tcMar>
-              <w:top w:w="70" w:type="dxa"/>
-              <w:bottom w:w="70" w:type="dxa"/>
-            </w:tcMar>
-          </w:tcPr>
-          <w:p>
-            <w:pPr>
-              <w:pStyle w:val="Normal"/>
-              <w:rPr/>
-            </w:pPr>
-            <w:r>
-              <w:rPr>
-                <w:rFonts w:eastAsia="Arial" w:cs="Arial"/>
-                <w:color w:val="1A1A2E"/>
-                <w:sz w:val="20"/>
-                <w:szCs w:val="20"/>
-              </w:rPr>
-              <w:t>1-1024</w:t>
-            </w:r>
-          </w:p>
-        </w:tc>
-      </w:tr>
-      <w:tr>
-        <w:trPr/>
-        <w:tc>
-          <w:tcPr>
-            <w:tcW w:w="2398" w:type="dxa"/>
-            <w:tcBorders>
-              <w:top w:val="single" w:sz="2" w:space="0" w:color="C8DDE8"/>
-              <w:start w:val="single" w:sz="2" w:space="0" w:color="C8DDE8"/>
-              <w:bottom w:val="single" w:sz="2" w:space="0" w:color="C8DDE8"/>
-              <w:end w:val="single" w:sz="2" w:space="0" w:color="C8DDE8"/>
-            </w:tcBorders>
-            <w:shd w:fill="FFFFFF" w:val="clear"/>
-            <w:tcMar>
-              <w:top w:w="70" w:type="dxa"/>
-              <w:bottom w:w="70" w:type="dxa"/>
-            </w:tcMar>
-          </w:tcPr>
-          <w:p>
-            <w:pPr>
-              <w:pStyle w:val="Normal"/>
-              <w:rPr/>
-            </w:pPr>
-            <w:r>
-              <w:rPr>
-                <w:rFonts w:eastAsia="Arial" w:cs="Arial"/>
-                <w:color w:val="1A1A2E"/>
-                <w:sz w:val="20"/>
-                <w:szCs w:val="20"/>
-              </w:rPr>
-              <w:t>Lista</w:t>
-            </w:r>
-          </w:p>
-        </w:tc>
-        <w:tc>
-          <w:tcPr>
-            <w:tcW w:w="3160" w:type="dxa"/>
-            <w:tcBorders>
-              <w:top w:val="single" w:sz="2" w:space="0" w:color="C8DDE8"/>
-              <w:start w:val="single" w:sz="2" w:space="0" w:color="C8DDE8"/>
-              <w:bottom w:val="single" w:sz="2" w:space="0" w:color="C8DDE8"/>
-              <w:end w:val="single" w:sz="2" w:space="0" w:color="C8DDE8"/>
-            </w:tcBorders>
-            <w:shd w:fill="FFFFFF" w:val="clear"/>
-            <w:tcMar>
-              <w:top w:w="70" w:type="dxa"/>
-              <w:bottom w:w="70" w:type="dxa"/>
-            </w:tcMar>
-          </w:tcPr>
-          <w:p>
-            <w:pPr>
-              <w:pStyle w:val="Normal"/>
-              <w:rPr/>
-            </w:pPr>
-            <w:r>
-              <w:rPr>
-                <w:rFonts w:eastAsia="Arial" w:cs="Arial"/>
-                <w:color w:val="1A1A2E"/>
-                <w:sz w:val="20"/>
-                <w:szCs w:val="20"/>
-              </w:rPr>
-              <w:t>N,M,K</w:t>
-            </w:r>
-          </w:p>
-        </w:tc>
-        <w:tc>
-          <w:tcPr>
-            <w:tcW w:w="3802" w:type="dxa"/>
-            <w:tcBorders>
-              <w:top w:val="single" w:sz="2" w:space="0" w:color="C8DDE8"/>
-              <w:start w:val="single" w:sz="2" w:space="0" w:color="C8DDE8"/>
-              <w:bottom w:val="single" w:sz="2" w:space="0" w:color="C8DDE8"/>
-              <w:end w:val="single" w:sz="2" w:space="0" w:color="C8DDE8"/>
-            </w:tcBorders>
-            <w:shd w:fill="FFFFFF" w:val="clear"/>
-            <w:tcMar>
-              <w:top w:w="70" w:type="dxa"/>
-              <w:bottom w:w="70" w:type="dxa"/>
-            </w:tcMar>
-          </w:tcPr>
-          <w:p>
-            <w:pPr>
-              <w:pStyle w:val="Normal"/>
-              <w:rPr/>
-            </w:pPr>
-            <w:r>
-              <w:rPr>
-                <w:rFonts w:eastAsia="Arial" w:cs="Arial"/>
-                <w:color w:val="1A1A2E"/>
-                <w:sz w:val="20"/>
-                <w:szCs w:val="20"/>
-              </w:rPr>
-              <w:t>22,80,443,8080</w:t>
-            </w:r>
-          </w:p>
-        </w:tc>
-      </w:tr>
-      <w:tr>
-        <w:trPr/>
-        <w:tc>
-          <w:tcPr>
-            <w:tcW w:w="2398" w:type="dxa"/>
-            <w:tcBorders>
-              <w:top w:val="single" w:sz="2" w:space="0" w:color="C8DDE8"/>
-              <w:start w:val="single" w:sz="2" w:space="0" w:color="C8DDE8"/>
-              <w:bottom w:val="single" w:sz="2" w:space="0" w:color="C8DDE8"/>
-              <w:end w:val="single" w:sz="2" w:space="0" w:color="C8DDE8"/>
-            </w:tcBorders>
-            <w:shd w:fill="E8F4F8" w:val="clear"/>
-            <w:tcMar>
-              <w:top w:w="70" w:type="dxa"/>
-              <w:bottom w:w="70" w:type="dxa"/>
-            </w:tcMar>
-          </w:tcPr>
-          <w:p>
-            <w:pPr>
-              <w:pStyle w:val="Normal"/>
-              <w:rPr/>
-            </w:pPr>
-            <w:r>
-              <w:rPr>
-                <w:rFonts w:eastAsia="Arial" w:cs="Arial"/>
-                <w:color w:val="1A1A2E"/>
-                <w:sz w:val="20"/>
-                <w:szCs w:val="20"/>
-              </w:rPr>
-              <w:t>Misto</w:t>
-            </w:r>
-          </w:p>
-        </w:tc>
-        <w:tc>
-          <w:tcPr>
-            <w:tcW w:w="3160" w:type="dxa"/>
-            <w:tcBorders>
-              <w:top w:val="single" w:sz="2" w:space="0" w:color="C8DDE8"/>
-              <w:start w:val="single" w:sz="2" w:space="0" w:color="C8DDE8"/>
-              <w:bottom w:val="single" w:sz="2" w:space="0" w:color="C8DDE8"/>
-              <w:end w:val="single" w:sz="2" w:space="0" w:color="C8DDE8"/>
-            </w:tcBorders>
-            <w:shd w:fill="E8F4F8" w:val="clear"/>
-            <w:tcMar>
-              <w:top w:w="70" w:type="dxa"/>
-              <w:bottom w:w="70" w:type="dxa"/>
-            </w:tcMar>
-          </w:tcPr>
-          <w:p>
-            <w:pPr>
-              <w:pStyle w:val="Normal"/>
-              <w:rPr/>
-            </w:pPr>
-            <w:r>
-              <w:rPr>
-                <w:rFonts w:eastAsia="Arial" w:cs="Arial"/>
-                <w:color w:val="1A1A2E"/>
-                <w:sz w:val="20"/>
-                <w:szCs w:val="20"/>
-              </w:rPr>
-              <w:t>N,M-K</w:t>
-            </w:r>
-          </w:p>
-        </w:tc>
-        <w:tc>
-          <w:tcPr>
-            <w:tcW w:w="3802" w:type="dxa"/>
-            <w:tcBorders>
-              <w:top w:val="single" w:sz="2" w:space="0" w:color="C8DDE8"/>
-              <w:start w:val="single" w:sz="2" w:space="0" w:color="C8DDE8"/>
-              <w:bottom w:val="single" w:sz="2" w:space="0" w:color="C8DDE8"/>
-              <w:end w:val="single" w:sz="2" w:space="0" w:color="C8DDE8"/>
-            </w:tcBorders>
-            <w:shd w:fill="E8F4F8" w:val="clear"/>
-            <w:tcMar>
-              <w:top w:w="70" w:type="dxa"/>
-              <w:bottom w:w="70" w:type="dxa"/>
-            </w:tcMar>
-          </w:tcPr>
-          <w:p>
-            <w:pPr>
-              <w:pStyle w:val="Normal"/>
-              <w:rPr/>
-            </w:pPr>
-            <w:r>
-              <w:rPr>
-                <w:rFonts w:eastAsia="Arial" w:cs="Arial"/>
-                <w:color w:val="1A1A2E"/>
-                <w:sz w:val="20"/>
-                <w:szCs w:val="20"/>
-              </w:rPr>
-              <w:t>22,80-90,443</w:t>
-            </w:r>
-          </w:p>
-        </w:tc>
-      </w:tr>
-    </w:tbl>
-    <w:p>
-      <w:pPr>
-        <w:pStyle w:val="Normal"/>
-        <w:spacing w:before="240" w:after="0"/>
-        <w:rPr/>
-      </w:pPr>
-      <w:r>
-        <w:rPr/>
-      </w:r>
-    </w:p>
-    <w:p>
-      <w:pPr>
-        <w:pStyle w:val="Heading2"/>
-        <w:spacing w:before="320" w:after="120"/>
-        <w:rPr/>
-      </w:pPr>
-      <w:r>
-        <w:rPr>
-          <w:rFonts w:eastAsia="Arial" w:cs="Arial"/>
-          <w:b/>
-          <w:bCs/>
-          <w:color w:val="2E86AB"/>
-          <w:sz w:val="28"/>
-          <w:szCs w:val="28"/>
-        </w:rPr>
-        <w:t>Tipo di scan</w:t>
-      </w:r>
-    </w:p>
-    <w:tbl>
-      <w:tblPr>
-        <w:tblW w:w="9360" w:type="dxa"/>
-        <w:jc w:val="start"/>
-        <w:tblInd w:w="0" w:type="dxa"/>
-        <w:tblLayout w:type="fixed"/>
-        <w:tblCellMar>
-          <w:top w:w="80" w:type="dxa"/>
-          <w:start w:w="140" w:type="dxa"/>
-          <w:bottom w:w="80" w:type="dxa"/>
-          <w:end w:w="100" w:type="dxa"/>
-        </w:tblCellMar>
-      </w:tblPr>
-      <w:tblGrid>
-        <w:gridCol w:w="2000"/>
-        <w:gridCol w:w="3200"/>
-        <w:gridCol w:w="2080"/>
-        <w:gridCol w:w="2080"/>
-      </w:tblGrid>
-      <w:tr>
-        <w:trPr>
-          <w:tblHeader w:val="true"/>
-        </w:trPr>
-        <w:tc>
-          <w:tcPr>
-            <w:tcW w:w="2000" w:type="dxa"/>
-            <w:tcBorders>
-              <w:top w:val="single" w:sz="2" w:space="0" w:color="1E3A5F"/>
-              <w:start w:val="single" w:sz="2" w:space="0" w:color="1E3A5F"/>
-              <w:bottom w:val="single" w:sz="2" w:space="0" w:color="1E3A5F"/>
-              <w:end w:val="single" w:sz="2" w:space="0" w:color="1E3A5F"/>
-            </w:tcBorders>
-            <w:shd w:fill="1E3A5F" w:val="clear"/>
-            <w:vAlign w:val="center"/>
-          </w:tcPr>
-          <w:p>
-            <w:pPr>
-              <w:pStyle w:val="Normal"/>
-              <w:jc w:val="center"/>
-              <w:rPr/>
-            </w:pPr>
-            <w:r>
-              <w:rPr>
-                <w:rFonts w:eastAsia="Arial" w:cs="Arial"/>
-                <w:b/>
-                <w:bCs/>
-                <w:color w:val="FFFFFF"/>
-                <w:sz w:val="20"/>
-                <w:szCs w:val="20"/>
-              </w:rPr>
-              <w:t>Tipo</w:t>
-            </w:r>
-          </w:p>
-        </w:tc>
-        <w:tc>
-          <w:tcPr>
-            <w:tcW w:w="3200" w:type="dxa"/>
-            <w:tcBorders>
-              <w:top w:val="single" w:sz="2" w:space="0" w:color="1E3A5F"/>
-              <w:start w:val="single" w:sz="2" w:space="0" w:color="1E3A5F"/>
-              <w:bottom w:val="single" w:sz="2" w:space="0" w:color="1E3A5F"/>
-              <w:end w:val="single" w:sz="2" w:space="0" w:color="1E3A5F"/>
-            </w:tcBorders>
-            <w:shd w:fill="1E3A5F" w:val="clear"/>
-            <w:vAlign w:val="center"/>
-          </w:tcPr>
-          <w:p>
-            <w:pPr>
-              <w:pStyle w:val="Normal"/>
-              <w:jc w:val="center"/>
-              <w:rPr/>
-            </w:pPr>
-            <w:r>
-              <w:rPr>
-                <w:rFonts w:eastAsia="Arial" w:cs="Arial"/>
-                <w:b/>
-                <w:bCs/>
-                <w:color w:val="FFFFFF"/>
-                <w:sz w:val="20"/>
-                <w:szCs w:val="20"/>
-              </w:rPr>
-              <w:t>Descrizione</w:t>
-            </w:r>
-          </w:p>
-        </w:tc>
-        <w:tc>
-          <w:tcPr>
-            <w:tcW w:w="2080" w:type="dxa"/>
-            <w:tcBorders>
-              <w:top w:val="single" w:sz="2" w:space="0" w:color="1E3A5F"/>
-              <w:start w:val="single" w:sz="2" w:space="0" w:color="1E3A5F"/>
-              <w:bottom w:val="single" w:sz="2" w:space="0" w:color="1E3A5F"/>
-              <w:end w:val="single" w:sz="2" w:space="0" w:color="1E3A5F"/>
-            </w:tcBorders>
-            <w:shd w:fill="1E3A5F" w:val="clear"/>
-            <w:vAlign w:val="center"/>
-          </w:tcPr>
-          <w:p>
-            <w:pPr>
-              <w:pStyle w:val="Normal"/>
-              <w:jc w:val="center"/>
-              <w:rPr/>
-            </w:pPr>
-            <w:r>
-              <w:rPr>
-                <w:rFonts w:eastAsia="Arial" w:cs="Arial"/>
-                <w:b/>
-                <w:bCs/>
-                <w:color w:val="FFFFFF"/>
-                <w:sz w:val="20"/>
-                <w:szCs w:val="20"/>
-              </w:rPr>
-              <w:t>Vantaggi</w:t>
-            </w:r>
-          </w:p>
-        </w:tc>
-        <w:tc>
-          <w:tcPr>
-            <w:tcW w:w="2080" w:type="dxa"/>
-            <w:tcBorders>
-              <w:top w:val="single" w:sz="2" w:space="0" w:color="1E3A5F"/>
-              <w:start w:val="single" w:sz="2" w:space="0" w:color="1E3A5F"/>
-              <w:bottom w:val="single" w:sz="2" w:space="0" w:color="1E3A5F"/>
-              <w:end w:val="single" w:sz="2" w:space="0" w:color="1E3A5F"/>
-            </w:tcBorders>
-            <w:shd w:fill="1E3A5F" w:val="clear"/>
-            <w:vAlign w:val="center"/>
-          </w:tcPr>
-          <w:p>
-            <w:pPr>
-              <w:pStyle w:val="Normal"/>
-              <w:jc w:val="center"/>
-              <w:rPr/>
-            </w:pPr>
-            <w:r>
-              <w:rPr>
-                <w:rFonts w:eastAsia="Arial" w:cs="Arial"/>
-                <w:b/>
-                <w:bCs/>
-                <w:color w:val="FFFFFF"/>
-                <w:sz w:val="20"/>
-                <w:szCs w:val="20"/>
-              </w:rPr>
-              <w:t>Svantaggi</w:t>
-            </w:r>
-          </w:p>
-        </w:tc>
-      </w:tr>
-      <w:tr>
-        <w:trPr/>
-        <w:tc>
-          <w:tcPr>
-            <w:tcW w:w="2000" w:type="dxa"/>
-            <w:tcBorders>
-              <w:top w:val="single" w:sz="2" w:space="0" w:color="C8DDE8"/>
-              <w:start w:val="single" w:sz="2" w:space="0" w:color="C8DDE8"/>
-              <w:bottom w:val="single" w:sz="2" w:space="0" w:color="C8DDE8"/>
-              <w:end w:val="single" w:sz="2" w:space="0" w:color="C8DDE8"/>
-            </w:tcBorders>
-            <w:shd w:fill="FFFFFF" w:val="clear"/>
-            <w:tcMar>
-              <w:top w:w="70" w:type="dxa"/>
-              <w:bottom w:w="70" w:type="dxa"/>
-            </w:tcMar>
-          </w:tcPr>
-          <w:p>
-            <w:pPr>
-              <w:pStyle w:val="Normal"/>
-              <w:rPr/>
-            </w:pPr>
-            <w:r>
-              <w:rPr>
-                <w:rFonts w:eastAsia="Arial" w:cs="Arial"/>
-                <w:color w:val="1A1A2E"/>
-                <w:sz w:val="20"/>
-                <w:szCs w:val="20"/>
-              </w:rPr>
-              <w:t>SYN Scan (default)</w:t>
-            </w:r>
-          </w:p>
-        </w:tc>
-        <w:tc>
-          <w:tcPr>
-            <w:tcW w:w="3200" w:type="dxa"/>
-            <w:tcBorders>
-              <w:top w:val="single" w:sz="2" w:space="0" w:color="C8DDE8"/>
-              <w:start w:val="single" w:sz="2" w:space="0" w:color="C8DDE8"/>
-              <w:bottom w:val="single" w:sz="2" w:space="0" w:color="C8DDE8"/>
-              <w:end w:val="single" w:sz="2" w:space="0" w:color="C8DDE8"/>
-            </w:tcBorders>
-            <w:shd w:fill="FFFFFF" w:val="clear"/>
-            <w:tcMar>
-              <w:top w:w="70" w:type="dxa"/>
-              <w:bottom w:w="70" w:type="dxa"/>
-            </w:tcMar>
-          </w:tcPr>
-          <w:p>
-            <w:pPr>
-              <w:pStyle w:val="Normal"/>
-              <w:rPr/>
-            </w:pPr>
-            <w:r>
-              <w:rPr>
-                <w:rFonts w:eastAsia="Arial" w:cs="Arial"/>
-                <w:color w:val="1A1A2E"/>
-                <w:sz w:val="20"/>
-                <w:szCs w:val="20"/>
-              </w:rPr>
-              <w:t>Invia SYN, analizza risposta. Non completa l'handshake.</w:t>
-            </w:r>
-          </w:p>
-        </w:tc>
-        <w:tc>
-          <w:tcPr>
-            <w:tcW w:w="2080" w:type="dxa"/>
-            <w:tcBorders>
-              <w:top w:val="single" w:sz="2" w:space="0" w:color="C8DDE8"/>
-              <w:start w:val="single" w:sz="2" w:space="0" w:color="C8DDE8"/>
-              <w:bottom w:val="single" w:sz="2" w:space="0" w:color="C8DDE8"/>
-              <w:end w:val="single" w:sz="2" w:space="0" w:color="C8DDE8"/>
-            </w:tcBorders>
-            <w:shd w:fill="FFFFFF" w:val="clear"/>
-            <w:tcMar>
-              <w:top w:w="70" w:type="dxa"/>
-              <w:bottom w:w="70" w:type="dxa"/>
-            </w:tcMar>
-          </w:tcPr>
-          <w:p>
-            <w:pPr>
-              <w:pStyle w:val="Normal"/>
-              <w:rPr/>
-            </w:pPr>
-            <w:r>
-              <w:rPr>
-                <w:rFonts w:eastAsia="Arial" w:cs="Arial"/>
-                <w:color w:val="1A1A2E"/>
-                <w:sz w:val="20"/>
-                <w:szCs w:val="20"/>
-              </w:rPr>
-              <w:t>Veloce, non loggato</w:t>
-            </w:r>
-          </w:p>
-        </w:tc>
-        <w:tc>
-          <w:tcPr>
-            <w:tcW w:w="2080" w:type="dxa"/>
-            <w:tcBorders>
-              <w:top w:val="single" w:sz="2" w:space="0" w:color="C8DDE8"/>
-              <w:start w:val="single" w:sz="2" w:space="0" w:color="C8DDE8"/>
-              <w:bottom w:val="single" w:sz="2" w:space="0" w:color="C8DDE8"/>
-              <w:end w:val="single" w:sz="2" w:space="0" w:color="C8DDE8"/>
-            </w:tcBorders>
-            <w:shd w:fill="FFFFFF" w:val="clear"/>
-            <w:tcMar>
-              <w:top w:w="70" w:type="dxa"/>
-              <w:bottom w:w="70" w:type="dxa"/>
-            </w:tcMar>
-          </w:tcPr>
-          <w:p>
-            <w:pPr>
-              <w:pStyle w:val="Normal"/>
-              <w:rPr/>
-            </w:pPr>
-            <w:r>
-              <w:rPr>
-                <w:rFonts w:eastAsia="Arial" w:cs="Arial"/>
-                <w:color w:val="1A1A2E"/>
-                <w:sz w:val="20"/>
-                <w:szCs w:val="20"/>
-              </w:rPr>
-              <w:t>Richiede root</w:t>
-            </w:r>
-          </w:p>
-        </w:tc>
-      </w:tr>
-      <w:tr>
-        <w:trPr/>
-        <w:tc>
-          <w:tcPr>
-            <w:tcW w:w="2000" w:type="dxa"/>
-            <w:tcBorders>
-              <w:top w:val="single" w:sz="2" w:space="0" w:color="C8DDE8"/>
-              <w:start w:val="single" w:sz="2" w:space="0" w:color="C8DDE8"/>
-              <w:bottom w:val="single" w:sz="2" w:space="0" w:color="C8DDE8"/>
-              <w:end w:val="single" w:sz="2" w:space="0" w:color="C8DDE8"/>
-            </w:tcBorders>
-            <w:shd w:fill="E8F4F8" w:val="clear"/>
-            <w:tcMar>
-              <w:top w:w="70" w:type="dxa"/>
-              <w:bottom w:w="70" w:type="dxa"/>
-            </w:tcMar>
-          </w:tcPr>
-          <w:p>
-            <w:pPr>
-              <w:pStyle w:val="Normal"/>
-              <w:rPr/>
-            </w:pPr>
-            <w:r>
-              <w:rPr>
-                <w:rFonts w:eastAsia="Arial" w:cs="Arial"/>
-                <w:color w:val="1A1A2E"/>
-                <w:sz w:val="20"/>
-                <w:szCs w:val="20"/>
-              </w:rPr>
-              <w:t>Full Connect</w:t>
-            </w:r>
-          </w:p>
-        </w:tc>
-        <w:tc>
-          <w:tcPr>
-            <w:tcW w:w="3200" w:type="dxa"/>
-            <w:tcBorders>
-              <w:top w:val="single" w:sz="2" w:space="0" w:color="C8DDE8"/>
-              <w:start w:val="single" w:sz="2" w:space="0" w:color="C8DDE8"/>
-              <w:bottom w:val="single" w:sz="2" w:space="0" w:color="C8DDE8"/>
-              <w:end w:val="single" w:sz="2" w:space="0" w:color="C8DDE8"/>
-            </w:tcBorders>
-            <w:shd w:fill="E8F4F8" w:val="clear"/>
-            <w:tcMar>
-              <w:top w:w="70" w:type="dxa"/>
-              <w:bottom w:w="70" w:type="dxa"/>
-            </w:tcMar>
-          </w:tcPr>
-          <w:p>
-            <w:pPr>
-              <w:pStyle w:val="Normal"/>
-              <w:rPr/>
-            </w:pPr>
-            <w:r>
-              <w:rPr>
-                <w:rFonts w:eastAsia="Arial" w:cs="Arial"/>
-                <w:color w:val="1A1A2E"/>
-                <w:sz w:val="20"/>
-                <w:szCs w:val="20"/>
-              </w:rPr>
-              <w:t>Completa il three-way handshake via socket OS.</w:t>
-            </w:r>
-          </w:p>
-        </w:tc>
-        <w:tc>
-          <w:tcPr>
-            <w:tcW w:w="2080" w:type="dxa"/>
-            <w:tcBorders>
-              <w:top w:val="single" w:sz="2" w:space="0" w:color="C8DDE8"/>
-              <w:start w:val="single" w:sz="2" w:space="0" w:color="C8DDE8"/>
-              <w:bottom w:val="single" w:sz="2" w:space="0" w:color="C8DDE8"/>
-              <w:end w:val="single" w:sz="2" w:space="0" w:color="C8DDE8"/>
-            </w:tcBorders>
-            <w:shd w:fill="E8F4F8" w:val="clear"/>
-            <w:tcMar>
-              <w:top w:w="70" w:type="dxa"/>
-              <w:bottom w:w="70" w:type="dxa"/>
-            </w:tcMar>
-          </w:tcPr>
-          <w:p>
-            <w:pPr>
-              <w:pStyle w:val="Normal"/>
-              <w:rPr/>
-            </w:pPr>
-            <w:r>
-              <w:rPr>
-                <w:rFonts w:eastAsia="Arial" w:cs="Arial"/>
-                <w:color w:val="1A1A2E"/>
-                <w:sz w:val="20"/>
-                <w:szCs w:val="20"/>
-              </w:rPr>
-              <w:t>No root, affidabile</w:t>
-            </w:r>
-          </w:p>
-        </w:tc>
-        <w:tc>
-          <w:tcPr>
-            <w:tcW w:w="2080" w:type="dxa"/>
-            <w:tcBorders>
-              <w:top w:val="single" w:sz="2" w:space="0" w:color="C8DDE8"/>
-              <w:start w:val="single" w:sz="2" w:space="0" w:color="C8DDE8"/>
-              <w:bottom w:val="single" w:sz="2" w:space="0" w:color="C8DDE8"/>
-              <w:end w:val="single" w:sz="2" w:space="0" w:color="C8DDE8"/>
-            </w:tcBorders>
-            <w:shd w:fill="E8F4F8" w:val="clear"/>
-            <w:tcMar>
-              <w:top w:w="70" w:type="dxa"/>
-              <w:bottom w:w="70" w:type="dxa"/>
-            </w:tcMar>
-          </w:tcPr>
-          <w:p>
-            <w:pPr>
-              <w:pStyle w:val="Normal"/>
-              <w:rPr/>
-            </w:pPr>
-            <w:r>
-              <w:rPr>
-                <w:rFonts w:eastAsia="Arial" w:cs="Arial"/>
-                <w:color w:val="1A1A2E"/>
-                <w:sz w:val="20"/>
-                <w:szCs w:val="20"/>
-              </w:rPr>
-              <w:t>Più lento, loggato</w:t>
-            </w:r>
-          </w:p>
-        </w:tc>
-      </w:tr>
-      <w:tr>
-        <w:trPr/>
-        <w:tc>
-          <w:tcPr>
-            <w:tcW w:w="2000" w:type="dxa"/>
-            <w:tcBorders>
-              <w:top w:val="single" w:sz="2" w:space="0" w:color="C8DDE8"/>
-              <w:start w:val="single" w:sz="2" w:space="0" w:color="C8DDE8"/>
-              <w:bottom w:val="single" w:sz="2" w:space="0" w:color="C8DDE8"/>
-              <w:end w:val="single" w:sz="2" w:space="0" w:color="C8DDE8"/>
-            </w:tcBorders>
-            <w:shd w:fill="FFFFFF" w:val="clear"/>
-            <w:tcMar>
-              <w:top w:w="70" w:type="dxa"/>
-              <w:bottom w:w="70" w:type="dxa"/>
-            </w:tcMar>
-          </w:tcPr>
-          <w:p>
-            <w:pPr>
-              <w:pStyle w:val="Normal"/>
-              <w:rPr/>
-            </w:pPr>
-            <w:r>
-              <w:rPr>
-                <w:rFonts w:eastAsia="Arial" w:cs="Arial"/>
-                <w:color w:val="1A1A2E"/>
-                <w:sz w:val="20"/>
-                <w:szCs w:val="20"/>
-              </w:rPr>
-              <w:t>UDP Scan</w:t>
-            </w:r>
-          </w:p>
-        </w:tc>
-        <w:tc>
-          <w:tcPr>
-            <w:tcW w:w="3200" w:type="dxa"/>
-            <w:tcBorders>
-              <w:top w:val="single" w:sz="2" w:space="0" w:color="C8DDE8"/>
-              <w:start w:val="single" w:sz="2" w:space="0" w:color="C8DDE8"/>
-              <w:bottom w:val="single" w:sz="2" w:space="0" w:color="C8DDE8"/>
-              <w:end w:val="single" w:sz="2" w:space="0" w:color="C8DDE8"/>
-            </w:tcBorders>
-            <w:shd w:fill="FFFFFF" w:val="clear"/>
-            <w:tcMar>
-              <w:top w:w="70" w:type="dxa"/>
-              <w:bottom w:w="70" w:type="dxa"/>
-            </w:tcMar>
-          </w:tcPr>
-          <w:p>
-            <w:pPr>
-              <w:pStyle w:val="Normal"/>
-              <w:rPr/>
-            </w:pPr>
-            <w:r>
-              <w:rPr>
-                <w:rFonts w:eastAsia="Arial" w:cs="Arial"/>
-                <w:color w:val="1A1A2E"/>
-                <w:sz w:val="20"/>
-                <w:szCs w:val="20"/>
-              </w:rPr>
-              <w:t>Invia UDP, analizza ICMP unreachable.</w:t>
-            </w:r>
-          </w:p>
-        </w:tc>
-        <w:tc>
-          <w:tcPr>
-            <w:tcW w:w="2080" w:type="dxa"/>
-            <w:tcBorders>
-              <w:top w:val="single" w:sz="2" w:space="0" w:color="C8DDE8"/>
-              <w:start w:val="single" w:sz="2" w:space="0" w:color="C8DDE8"/>
-              <w:bottom w:val="single" w:sz="2" w:space="0" w:color="C8DDE8"/>
-              <w:end w:val="single" w:sz="2" w:space="0" w:color="C8DDE8"/>
-            </w:tcBorders>
-            <w:shd w:fill="FFFFFF" w:val="clear"/>
-            <w:tcMar>
-              <w:top w:w="70" w:type="dxa"/>
-              <w:bottom w:w="70" w:type="dxa"/>
-            </w:tcMar>
-          </w:tcPr>
-          <w:p>
-            <w:pPr>
-              <w:pStyle w:val="Normal"/>
-              <w:rPr/>
-            </w:pPr>
-            <w:r>
-              <w:rPr>
-                <w:rFonts w:eastAsia="Arial" w:cs="Arial"/>
-                <w:color w:val="1A1A2E"/>
-                <w:sz w:val="20"/>
-                <w:szCs w:val="20"/>
-              </w:rPr>
-              <w:t>Scopre servizi UDP</w:t>
-            </w:r>
-          </w:p>
-        </w:tc>
-        <w:tc>
-          <w:tcPr>
-            <w:tcW w:w="2080" w:type="dxa"/>
-            <w:tcBorders>
-              <w:top w:val="single" w:sz="2" w:space="0" w:color="C8DDE8"/>
-              <w:start w:val="single" w:sz="2" w:space="0" w:color="C8DDE8"/>
-              <w:bottom w:val="single" w:sz="2" w:space="0" w:color="C8DDE8"/>
-              <w:end w:val="single" w:sz="2" w:space="0" w:color="C8DDE8"/>
-            </w:tcBorders>
-            <w:shd w:fill="FFFFFF" w:val="clear"/>
-            <w:tcMar>
-              <w:top w:w="70" w:type="dxa"/>
-              <w:bottom w:w="70" w:type="dxa"/>
-            </w:tcMar>
-          </w:tcPr>
-          <w:p>
-            <w:pPr>
-              <w:pStyle w:val="Normal"/>
-              <w:rPr/>
-            </w:pPr>
-            <w:r>
-              <w:rPr>
-                <w:rFonts w:eastAsia="Arial" w:cs="Arial"/>
-                <w:color w:val="1A1A2E"/>
-                <w:sz w:val="20"/>
-                <w:szCs w:val="20"/>
-              </w:rPr>
-              <w:t>Lento, ambiguo</w:t>
-            </w:r>
-          </w:p>
-        </w:tc>
-      </w:tr>
-    </w:tbl>
-    <w:p>
-      <w:pPr>
-        <w:pStyle w:val="Normal"/>
-        <w:spacing w:before="300" w:after="0"/>
-        <w:rPr/>
       </w:pPr>
       <w:r>
         <w:rPr/>
@@ -10786,7 +9706,14 @@
         </w:rPr>
       </w:pPr>
       <w:r>
-        <w:rPr/>
+        <w:rPr>
+          <w:rFonts w:eastAsia="Arial" w:cs="Arial"/>
+          <w:b/>
+          <w:bCs/>
+          <w:color w:val="1A1A2E"/>
+          <w:sz w:val="24"/>
+          <w:szCs w:val="24"/>
+        </w:rPr>
       </w:r>
     </w:p>
     <w:p>
@@ -11004,7 +9931,7 @@
     </w:p>
     <w:tbl>
       <w:tblPr>
-        <w:tblW w:w="9360" w:type="dxa"/>
+        <w:tblW w:w="9389" w:type="dxa"/>
         <w:jc w:val="start"/>
         <w:tblInd w:w="0" w:type="dxa"/>
         <w:tblLayout w:type="fixed"/>
@@ -11016,8 +9943,8 @@
         </w:tblCellMar>
       </w:tblPr>
       <w:tblGrid>
-        <w:gridCol w:w="2798"/>
-        <w:gridCol w:w="6562"/>
+        <w:gridCol w:w="2797"/>
+        <w:gridCol w:w="6592"/>
       </w:tblGrid>
       <w:tr>
         <w:trPr>
@@ -11025,7 +9952,7 @@
         </w:trPr>
         <w:tc>
           <w:tcPr>
-            <w:tcW w:w="2798" w:type="dxa"/>
+            <w:tcW w:w="2797" w:type="dxa"/>
             <w:tcBorders>
               <w:top w:val="single" w:sz="2" w:space="0" w:color="1E3A5F"/>
               <w:start w:val="single" w:sz="2" w:space="0" w:color="1E3A5F"/>
@@ -11056,7 +9983,7 @@
         </w:tc>
         <w:tc>
           <w:tcPr>
-            <w:tcW w:w="6562" w:type="dxa"/>
+            <w:tcW w:w="6592" w:type="dxa"/>
             <w:tcBorders>
               <w:top w:val="single" w:sz="2" w:space="0" w:color="1E3A5F"/>
               <w:start w:val="single" w:sz="2" w:space="0" w:color="1E3A5F"/>
@@ -11090,7 +10017,7 @@
         <w:trPr/>
         <w:tc>
           <w:tcPr>
-            <w:tcW w:w="2798" w:type="dxa"/>
+            <w:tcW w:w="2797" w:type="dxa"/>
             <w:tcBorders>
               <w:top w:val="single" w:sz="2" w:space="0" w:color="C8DDE8"/>
               <w:start w:val="single" w:sz="2" w:space="0" w:color="C8DDE8"/>
@@ -11117,11 +10044,20 @@
               </w:rPr>
               <w:t>start_sniff</w:t>
             </w:r>
-          </w:p>
-        </w:tc>
-        <w:tc>
-          <w:tcPr>
-            <w:tcW w:w="6562" w:type="dxa"/>
+            <w:r>
+              <w:rPr>
+                <w:rFonts w:eastAsia="Arial" w:cs="Arial"/>
+                <w:color w:val="1A1A2E"/>
+                <w:sz w:val="20"/>
+                <w:szCs w:val="20"/>
+              </w:rPr>
+              <w:t>er</w:t>
+            </w:r>
+          </w:p>
+        </w:tc>
+        <w:tc>
+          <w:tcPr>
+            <w:tcW w:w="6592" w:type="dxa"/>
             <w:tcBorders>
               <w:top w:val="single" w:sz="2" w:space="0" w:color="C8DDE8"/>
               <w:start w:val="single" w:sz="2" w:space="0" w:color="C8DDE8"/>
@@ -11155,7 +10091,7 @@
         <w:trPr/>
         <w:tc>
           <w:tcPr>
-            <w:tcW w:w="2798" w:type="dxa"/>
+            <w:tcW w:w="2797" w:type="dxa"/>
             <w:tcBorders>
               <w:top w:val="single" w:sz="2" w:space="0" w:color="C8DDE8"/>
               <w:start w:val="single" w:sz="2" w:space="0" w:color="C8DDE8"/>
@@ -11182,11 +10118,20 @@
               </w:rPr>
               <w:t>stop_sniff</w:t>
             </w:r>
-          </w:p>
-        </w:tc>
-        <w:tc>
-          <w:tcPr>
-            <w:tcW w:w="6562" w:type="dxa"/>
+            <w:r>
+              <w:rPr>
+                <w:rFonts w:eastAsia="Arial" w:cs="Arial"/>
+                <w:color w:val="1A1A2E"/>
+                <w:sz w:val="20"/>
+                <w:szCs w:val="20"/>
+              </w:rPr>
+              <w:t>er</w:t>
+            </w:r>
+          </w:p>
+        </w:tc>
+        <w:tc>
+          <w:tcPr>
+            <w:tcW w:w="6592" w:type="dxa"/>
             <w:tcBorders>
               <w:top w:val="single" w:sz="2" w:space="0" w:color="C8DDE8"/>
               <w:start w:val="single" w:sz="2" w:space="0" w:color="C8DDE8"/>
@@ -11220,7 +10165,7 @@
         <w:trPr/>
         <w:tc>
           <w:tcPr>
-            <w:tcW w:w="2798" w:type="dxa"/>
+            <w:tcW w:w="2797" w:type="dxa"/>
             <w:tcBorders>
               <w:top w:val="single" w:sz="2" w:space="0" w:color="C8DDE8"/>
               <w:start w:val="single" w:sz="2" w:space="0" w:color="C8DDE8"/>
@@ -11236,22 +10181,25 @@
           <w:p>
             <w:pPr>
               <w:pStyle w:val="Normal"/>
-              <w:rPr/>
-            </w:pPr>
-            <w:r>
-              <w:rPr>
-                <w:rFonts w:eastAsia="Arial" w:cs="Arial"/>
-                <w:color w:val="1A1A2E"/>
-                <w:sz w:val="20"/>
-                <w:szCs w:val="20"/>
-              </w:rPr>
-              <w:t>scan_lan</w:t>
-            </w:r>
-          </w:p>
-        </w:tc>
-        <w:tc>
-          <w:tcPr>
-            <w:tcW w:w="6562" w:type="dxa"/>
+              <w:rPr>
+                <w:lang w:val="en-US"/>
+              </w:rPr>
+            </w:pPr>
+            <w:r>
+              <w:rPr>
+                <w:rFonts w:eastAsia="Arial" w:cs="Arial"/>
+                <w:color w:val="1A1A2E"/>
+                <w:sz w:val="20"/>
+                <w:szCs w:val="20"/>
+                <w:lang w:val="en-US"/>
+              </w:rPr>
+              <w:t>get_hosts</w:t>
+            </w:r>
+          </w:p>
+        </w:tc>
+        <w:tc>
+          <w:tcPr>
+            <w:tcW w:w="6592" w:type="dxa"/>
             <w:tcBorders>
               <w:top w:val="single" w:sz="2" w:space="0" w:color="C8DDE8"/>
               <w:start w:val="single" w:sz="2" w:space="0" w:color="C8DDE8"/>
@@ -11285,7 +10233,7 @@
         <w:trPr/>
         <w:tc>
           <w:tcPr>
-            <w:tcW w:w="2798" w:type="dxa"/>
+            <w:tcW w:w="2797" w:type="dxa"/>
             <w:tcBorders>
               <w:top w:val="single" w:sz="2" w:space="0" w:color="C8DDE8"/>
               <w:start w:val="single" w:sz="2" w:space="0" w:color="C8DDE8"/>
@@ -11310,13 +10258,23 @@
                 <w:sz w:val="20"/>
                 <w:szCs w:val="20"/>
               </w:rPr>
-              <w:t>scan_ports</w:t>
-            </w:r>
-          </w:p>
-        </w:tc>
-        <w:tc>
-          <w:tcPr>
-            <w:tcW w:w="6562" w:type="dxa"/>
+              <w:t>port</w:t>
+            </w:r>
+            <w:r>
+              <w:rPr>
+                <w:rFonts w:eastAsia="Arial" w:cs="Arial"/>
+                <w:color w:val="1A1A2E"/>
+                <w:sz w:val="20"/>
+                <w:szCs w:val="20"/>
+                <w:lang w:val="en-US"/>
+              </w:rPr>
+              <w:t>_scan</w:t>
+            </w:r>
+          </w:p>
+        </w:tc>
+        <w:tc>
+          <w:tcPr>
+            <w:tcW w:w="6592" w:type="dxa"/>
             <w:tcBorders>
               <w:top w:val="single" w:sz="2" w:space="0" w:color="C8DDE8"/>
               <w:start w:val="single" w:sz="2" w:space="0" w:color="C8DDE8"/>
@@ -11350,7 +10308,7 @@
         <w:trPr/>
         <w:tc>
           <w:tcPr>
-            <w:tcW w:w="2798" w:type="dxa"/>
+            <w:tcW w:w="2797" w:type="dxa"/>
             <w:tcBorders>
               <w:top w:val="single" w:sz="2" w:space="0" w:color="C8DDE8"/>
               <w:start w:val="single" w:sz="2" w:space="0" w:color="C8DDE8"/>
@@ -11375,13 +10333,22 @@
                 <w:sz w:val="20"/>
                 <w:szCs w:val="20"/>
               </w:rPr>
-              <w:t>send_packet</w:t>
-            </w:r>
-          </w:p>
-        </w:tc>
-        <w:tc>
-          <w:tcPr>
-            <w:tcW w:w="6562" w:type="dxa"/>
+              <w:t>send</w:t>
+            </w:r>
+            <w:r>
+              <w:rPr>
+                <w:rFonts w:eastAsia="Arial" w:cs="Arial"/>
+                <w:color w:val="1A1A2E"/>
+                <w:sz w:val="20"/>
+                <w:szCs w:val="20"/>
+              </w:rPr>
+              <w:t>er</w:t>
+            </w:r>
+          </w:p>
+        </w:tc>
+        <w:tc>
+          <w:tcPr>
+            <w:tcW w:w="6592" w:type="dxa"/>
             <w:tcBorders>
               <w:top w:val="single" w:sz="2" w:space="0" w:color="C8DDE8"/>
               <w:start w:val="single" w:sz="2" w:space="0" w:color="C8DDE8"/>
@@ -11415,7 +10382,7 @@
         <w:trPr/>
         <w:tc>
           <w:tcPr>
-            <w:tcW w:w="2798" w:type="dxa"/>
+            <w:tcW w:w="2797" w:type="dxa"/>
             <w:tcBorders>
               <w:top w:val="single" w:sz="2" w:space="0" w:color="C8DDE8"/>
               <w:start w:val="single" w:sz="2" w:space="0" w:color="C8DDE8"/>
@@ -11446,7 +10413,7 @@
         </w:tc>
         <w:tc>
           <w:tcPr>
-            <w:tcW w:w="6562" w:type="dxa"/>
+            <w:tcW w:w="6592" w:type="dxa"/>
             <w:tcBorders>
               <w:top w:val="single" w:sz="2" w:space="0" w:color="C8DDE8"/>
               <w:start w:val="single" w:sz="2" w:space="0" w:color="C8DDE8"/>
@@ -11480,7 +10447,7 @@
         <w:trPr/>
         <w:tc>
           <w:tcPr>
-            <w:tcW w:w="2798" w:type="dxa"/>
+            <w:tcW w:w="2797" w:type="dxa"/>
             <w:tcBorders>
               <w:top w:val="single" w:sz="2" w:space="0" w:color="C8DDE8"/>
               <w:start w:val="single" w:sz="2" w:space="0" w:color="C8DDE8"/>
@@ -11511,7 +10478,7 @@
         </w:tc>
         <w:tc>
           <w:tcPr>
-            <w:tcW w:w="6562" w:type="dxa"/>
+            <w:tcW w:w="6592" w:type="dxa"/>
             <w:tcBorders>
               <w:top w:val="single" w:sz="2" w:space="0" w:color="C8DDE8"/>
               <w:start w:val="single" w:sz="2" w:space="0" w:color="C8DDE8"/>
@@ -11527,7 +10494,12 @@
           <w:p>
             <w:pPr>
               <w:pStyle w:val="Normal"/>
-              <w:rPr/>
+              <w:rPr>
+                <w:rFonts w:eastAsia="Arial" w:cs="Arial"/>
+                <w:color w:val="1A1A2E"/>
+                <w:sz w:val="20"/>
+                <w:szCs w:val="20"/>
+              </w:rPr>
             </w:pPr>
             <w:r>
               <w:rPr>
@@ -11537,6 +10509,159 @@
                 <w:szCs w:val="20"/>
               </w:rPr>
               <w:t>Restituisce la lista delle interfacce disponibili</w:t>
+            </w:r>
+          </w:p>
+        </w:tc>
+      </w:tr>
+      <w:tr>
+        <w:trPr/>
+        <w:tc>
+          <w:tcPr>
+            <w:tcW w:w="2797" w:type="dxa"/>
+            <w:tcBorders>
+              <w:start w:val="single" w:sz="2" w:space="0" w:color="C8DDE8"/>
+              <w:bottom w:val="single" w:sz="2" w:space="0" w:color="C8DDE8"/>
+              <w:end w:val="single" w:sz="2" w:space="0" w:color="C8DDE8"/>
+            </w:tcBorders>
+            <w:shd w:fill="FFFFFF" w:val="clear"/>
+            <w:tcMar>
+              <w:top w:w="70" w:type="dxa"/>
+              <w:bottom w:w="70" w:type="dxa"/>
+            </w:tcMar>
+          </w:tcPr>
+          <w:p>
+            <w:pPr>
+              <w:pStyle w:val="Normal"/>
+              <w:rPr>
+                <w:b/>
+                <w:bCs/>
+                <w:i w:val="false"/>
+                <w:iCs w:val="false"/>
+                <w:sz w:val="24"/>
+                <w:szCs w:val="24"/>
+                <w:lang w:val="en-US"/>
+              </w:rPr>
+            </w:pPr>
+            <w:r>
+              <w:rPr>
+                <w:bCs/>
+                <w:iCs w:val="false"/>
+                <w:szCs w:val="24"/>
+                <w:lang w:val="en-US"/>
+              </w:rPr>
+              <w:t>clear_packets</w:t>
+            </w:r>
+          </w:p>
+        </w:tc>
+        <w:tc>
+          <w:tcPr>
+            <w:tcW w:w="6592" w:type="dxa"/>
+            <w:tcBorders>
+              <w:start w:val="single" w:sz="2" w:space="0" w:color="C8DDE8"/>
+              <w:bottom w:val="single" w:sz="2" w:space="0" w:color="C8DDE8"/>
+              <w:end w:val="single" w:sz="2" w:space="0" w:color="C8DDE8"/>
+            </w:tcBorders>
+            <w:shd w:fill="FFFFFF" w:val="clear"/>
+            <w:tcMar>
+              <w:top w:w="70" w:type="dxa"/>
+              <w:bottom w:w="70" w:type="dxa"/>
+            </w:tcMar>
+          </w:tcPr>
+          <w:p>
+            <w:pPr>
+              <w:pStyle w:val="Normal"/>
+              <w:rPr>
+                <w:rFonts w:eastAsia="Arial" w:cs="Arial"/>
+                <w:b/>
+                <w:bCs/>
+                <w:i w:val="false"/>
+                <w:iCs w:val="false"/>
+                <w:color w:val="1A1A2E"/>
+                <w:sz w:val="20"/>
+                <w:szCs w:val="24"/>
+                <w:lang w:val="en-US"/>
+              </w:rPr>
+            </w:pPr>
+            <w:r>
+              <w:rPr>
+                <w:rFonts w:eastAsia="Arial" w:cs="Arial"/>
+                <w:bCs/>
+                <w:iCs w:val="false"/>
+                <w:color w:val="1A1A2E"/>
+                <w:sz w:val="20"/>
+                <w:szCs w:val="24"/>
+                <w:lang w:val="en-US"/>
+              </w:rPr>
+              <w:t>Rimuove dei pacchetti trovati</w:t>
+            </w:r>
+          </w:p>
+        </w:tc>
+      </w:tr>
+      <w:tr>
+        <w:trPr/>
+        <w:tc>
+          <w:tcPr>
+            <w:tcW w:w="2797" w:type="dxa"/>
+            <w:tcBorders>
+              <w:start w:val="single" w:sz="2" w:space="0" w:color="C8DDE8"/>
+              <w:bottom w:val="single" w:sz="2" w:space="0" w:color="C8DDE8"/>
+              <w:end w:val="single" w:sz="2" w:space="0" w:color="C8DDE8"/>
+            </w:tcBorders>
+            <w:shd w:fill="FFFFFF" w:val="clear"/>
+            <w:tcMar>
+              <w:top w:w="70" w:type="dxa"/>
+              <w:bottom w:w="70" w:type="dxa"/>
+            </w:tcMar>
+          </w:tcPr>
+          <w:p>
+            <w:pPr>
+              <w:pStyle w:val="Normal"/>
+              <w:rPr>
+                <w:lang w:val="en-US"/>
+              </w:rPr>
+            </w:pPr>
+            <w:r>
+              <w:rPr>
+                <w:lang w:val="en-US"/>
+              </w:rPr>
+              <w:t>packet_detail</w:t>
+            </w:r>
+          </w:p>
+        </w:tc>
+        <w:tc>
+          <w:tcPr>
+            <w:tcW w:w="6592" w:type="dxa"/>
+            <w:tcBorders>
+              <w:start w:val="single" w:sz="2" w:space="0" w:color="C8DDE8"/>
+              <w:bottom w:val="single" w:sz="2" w:space="0" w:color="C8DDE8"/>
+              <w:end w:val="single" w:sz="2" w:space="0" w:color="C8DDE8"/>
+            </w:tcBorders>
+            <w:shd w:fill="FFFFFF" w:val="clear"/>
+            <w:tcMar>
+              <w:top w:w="70" w:type="dxa"/>
+              <w:bottom w:w="70" w:type="dxa"/>
+            </w:tcMar>
+          </w:tcPr>
+          <w:p>
+            <w:pPr>
+              <w:pStyle w:val="Normal"/>
+              <w:rPr>
+                <w:rFonts w:eastAsia="Arial" w:cs="Arial"/>
+                <w:color w:val="1A1A2E"/>
+                <w:sz w:val="20"/>
+                <w:szCs w:val="20"/>
+                <w:lang w:val="en-US"/>
+              </w:rPr>
+            </w:pPr>
+            <w:r>
+              <w:rPr>
+                <w:rFonts w:eastAsia="Arial" w:cs="Arial"/>
+                <w:color w:val="1A1A2E"/>
+                <w:sz w:val="20"/>
+                <w:szCs w:val="20"/>
+                <w:lang w:val="en-US"/>
+              </w:rPr>
+              <w:t>Visualizza dettagli di un singolo pacchetto</w:t>
             </w:r>
           </w:p>
         </w:tc>
@@ -13735,7 +12860,16 @@
           <w:sz w:val="22"/>
           <w:szCs w:val="22"/>
         </w:rPr>
-        <w:t>Ridurre il range di porte, abbassare il timeout su reti veloci, o limitare la scansione agli host di interesse invece dell'intera subnet.</w:t>
+        <w:t>A</w:t>
+      </w:r>
+      <w:r>
+        <w:rPr>
+          <w:rFonts w:eastAsia="Arial" w:cs="Arial"/>
+          <w:color w:val="1A1A2E"/>
+          <w:sz w:val="22"/>
+          <w:szCs w:val="22"/>
+        </w:rPr>
+        <w:t>bbassare il timeout su reti veloci, o limitare la scansione agli host di interesse invece dell'intera subnet.</w:t>
       </w:r>
     </w:p>
     <w:p>
@@ -14362,7 +13496,7 @@
   </w:style>
   <w:style w:type="paragraph" w:styleId="Heading1">
     <w:name w:val="heading 1"/>
-    <w:basedOn w:val="Titolouser"/>
+    <w:basedOn w:val="Titolo"/>
     <w:qFormat/>
     <w:pPr>
       <w:spacing w:before="480" w:after="160"/>
@@ -14378,7 +13512,7 @@
   </w:style>
   <w:style w:type="paragraph" w:styleId="Heading2">
     <w:name w:val="heading 2"/>
-    <w:basedOn w:val="Titolouser"/>
+    <w:basedOn w:val="Titolo"/>
     <w:qFormat/>
     <w:pPr>
       <w:spacing w:before="320" w:after="120"/>
@@ -14394,7 +13528,7 @@
   </w:style>
   <w:style w:type="paragraph" w:styleId="Heading3">
     <w:name w:val="heading 3"/>
-    <w:basedOn w:val="Titolouser"/>
+    <w:basedOn w:val="Titolo"/>
     <w:qFormat/>
     <w:pPr>
       <w:spacing w:before="240" w:after="80"/>
@@ -14410,7 +13544,7 @@
   </w:style>
   <w:style w:type="paragraph" w:styleId="Heading4">
     <w:name w:val="heading 4"/>
-    <w:basedOn w:val="Titolouser"/>
+    <w:basedOn w:val="Titolo"/>
     <w:qFormat/>
     <w:pPr/>
     <w:rPr>
@@ -14421,7 +13555,7 @@
   </w:style>
   <w:style w:type="paragraph" w:styleId="Heading5">
     <w:name w:val="heading 5"/>
-    <w:basedOn w:val="Titolouser"/>
+    <w:basedOn w:val="Titolo"/>
     <w:qFormat/>
     <w:pPr/>
     <w:rPr>
@@ -14430,7 +13564,7 @@
   </w:style>
   <w:style w:type="paragraph" w:styleId="Heading6">
     <w:name w:val="heading 6"/>
-    <w:basedOn w:val="Titolouser"/>
+    <w:basedOn w:val="Titolo"/>
     <w:qFormat/>
     <w:pPr/>
     <w:rPr>
@@ -14446,8 +13580,8 @@
       <w:u w:val="single"/>
     </w:rPr>
   </w:style>
-  <w:style w:type="character" w:styleId="Caratterinotaapidipaginauser">
-    <w:name w:val="Caratteri nota a piè di pagina (user)"/>
+  <w:style w:type="character" w:styleId="Caratterinotaapidipagina">
+    <w:name w:val="Caratteri nota a piè di pagina"/>
     <w:uiPriority w:val="99"/>
     <w:semiHidden/>
     <w:unhideWhenUsed/>
@@ -14456,8 +13590,8 @@
       <w:vertAlign w:val="superscript"/>
     </w:rPr>
   </w:style>
-  <w:style w:type="character" w:styleId="Caratterinotaapidipagina">
-    <w:name w:val="Caratteri nota a piè di pagina"/>
+  <w:style w:type="character" w:styleId="Caratterinotaapidipaginauser">
+    <w:name w:val="Caratteri nota a piè di pagina (user)"/>
     <w:qFormat/>
     <w:rPr>
       <w:vertAlign w:val="superscript"/>
@@ -14480,8 +13614,8 @@
       <w:szCs w:val="20"/>
     </w:rPr>
   </w:style>
-  <w:style w:type="character" w:styleId="Caratterinotadichiusurauser">
-    <w:name w:val="Caratteri nota di chiusura (user)"/>
+  <w:style w:type="character" w:styleId="Caratterinotadichiusura">
+    <w:name w:val="Caratteri nota di chiusura"/>
     <w:uiPriority w:val="99"/>
     <w:semiHidden/>
     <w:unhideWhenUsed/>
@@ -14490,8 +13624,8 @@
       <w:vertAlign w:val="superscript"/>
     </w:rPr>
   </w:style>
-  <w:style w:type="character" w:styleId="Caratterinotadichiusura">
-    <w:name w:val="Caratteri nota di chiusura"/>
+  <w:style w:type="character" w:styleId="Caratterinotadichiusurauser">
+    <w:name w:val="Caratteri nota di chiusura (user)"/>
     <w:qFormat/>
     <w:rPr>
       <w:vertAlign w:val="superscript"/>
@@ -14600,7 +13734,7 @@
   </w:style>
   <w:style w:type="paragraph" w:styleId="Title">
     <w:name w:val="Title"/>
-    <w:basedOn w:val="Titolouser"/>
+    <w:basedOn w:val="Titolo"/>
     <w:qFormat/>
     <w:pPr/>
     <w:rPr>
@@ -14678,6 +13812,13 @@
       <w:szCs w:val="20"/>
     </w:rPr>
   </w:style>
+  <w:style w:type="paragraph" w:styleId="Intestazioneepidipagina">
+    <w:name w:val="Intestazione e piè di pagina"/>
+    <w:basedOn w:val="Normal"/>
+    <w:qFormat/>
+    <w:pPr/>
+    <w:rPr/>
+  </w:style>
   <w:style w:type="paragraph" w:styleId="Intestazioneepidipaginauser">
     <w:name w:val="Intestazione e piè di pagina (user)"/>
     <w:basedOn w:val="Normal"/>
@@ -14685,24 +13826,40 @@
     <w:pPr/>
     <w:rPr/>
   </w:style>
-  <w:style w:type="paragraph" w:styleId="Intestazioneepidipagina">
-    <w:name w:val="Intestazione e piè di pagina"/>
-    <w:basedOn w:val="Normal"/>
-    <w:qFormat/>
-    <w:pPr/>
-    <w:rPr/>
-  </w:style>
   <w:style w:type="paragraph" w:styleId="Header">
     <w:name w:val="header"/>
-    <w:basedOn w:val="Intestazioneepidipaginauser"/>
+    <w:basedOn w:val="Intestazioneepidipagina"/>
     <w:pPr/>
     <w:rPr/>
   </w:style>
   <w:style w:type="paragraph" w:styleId="Footer">
     <w:name w:val="footer"/>
-    <w:basedOn w:val="Intestazioneepidipaginauser"/>
+    <w:basedOn w:val="Intestazioneepidipagina"/>
     <w:pPr/>
     <w:rPr/>
+  </w:style>
+  <w:style w:type="paragraph" w:styleId="Contenutotabella">
+    <w:name w:val="Contenuto tabella"/>
+    <w:basedOn w:val="Normal"/>
+    <w:qFormat/>
+    <w:pPr>
+      <w:widowControl w:val="false"/>
+      <w:suppressLineNumbers/>
+    </w:pPr>
+    <w:rPr/>
+  </w:style>
+  <w:style w:type="paragraph" w:styleId="Titolotabella">
+    <w:name w:val="Titolo tabella"/>
+    <w:basedOn w:val="Contenutotabella"/>
+    <w:qFormat/>
+    <w:pPr>
+      <w:suppressLineNumbers/>
+      <w:jc w:val="center"/>
+    </w:pPr>
+    <w:rPr>
+      <w:b/>
+      <w:bCs/>
+    </w:rPr>
   </w:style>
 </w:styles>
 </file>

</xml_diff>